<commit_message>
First attempt to fit bandwidth
</commit_message>
<xml_diff>
--- a/Critical_review.docx
+++ b/Critical_review.docx
@@ -15,23 +15,21 @@
           <w:rFonts w:ascii="Times New Roman" w:hAnsi="Times New Roman" w:cs="Times New Roman"/>
           <w:sz w:val="28"/>
         </w:rPr>
-        <w:t xml:space="preserve">Pla de </w:t>
-      </w:r>
-      <w:proofErr w:type="spellStart"/>
+        <w:t>Revisió Crítica</w:t>
+      </w:r>
       <w:r>
         <w:rPr>
           <w:rFonts w:ascii="Times New Roman" w:hAnsi="Times New Roman" w:cs="Times New Roman"/>
           <w:sz w:val="28"/>
         </w:rPr>
-        <w:t>Treball</w:t>
-      </w:r>
-      <w:proofErr w:type="spellEnd"/>
+        <w:t xml:space="preserve">— </w:t>
+      </w:r>
       <w:r>
         <w:rPr>
           <w:rFonts w:ascii="Times New Roman" w:hAnsi="Times New Roman" w:cs="Times New Roman"/>
           <w:sz w:val="28"/>
         </w:rPr>
-        <w:t xml:space="preserve"> — Work Plan</w:t>
+        <w:t>Critical Review</w:t>
       </w:r>
     </w:p>
     <w:p>
@@ -59,25 +57,7 @@
           <w:sz w:val="22"/>
           <w:bdr w:val="none" w:sz="0" w:space="0" w:color="auto" w:frame="1"/>
         </w:rPr>
-        <w:t xml:space="preserve">: On-chip entangled photon source for robust and </w:t>
-      </w:r>
-      <w:proofErr w:type="spellStart"/>
-      <w:r>
-        <w:rPr>
-          <w:color w:val="313131"/>
-          <w:sz w:val="22"/>
-          <w:bdr w:val="none" w:sz="0" w:space="0" w:color="auto" w:frame="1"/>
-        </w:rPr>
-        <w:t>miniaturizable</w:t>
-      </w:r>
-      <w:proofErr w:type="spellEnd"/>
-      <w:r>
-        <w:rPr>
-          <w:color w:val="313131"/>
-          <w:sz w:val="22"/>
-          <w:bdr w:val="none" w:sz="0" w:space="0" w:color="auto" w:frame="1"/>
-        </w:rPr>
-        <w:t xml:space="preserve"> quantum communication transmitter</w:t>
+        <w:t>: On-chip entangled photon source for robust and miniaturizable quantum communication transmitter</w:t>
       </w:r>
       <w:r>
         <w:rPr>
@@ -258,6 +238,61 @@
     <w:p>
       <w:pPr>
         <w:pStyle w:val="NormalWeb"/>
+        <w:rPr>
+          <w:color w:val="313131"/>
+          <w:sz w:val="22"/>
+          <w:bdr w:val="none" w:sz="0" w:space="0" w:color="auto" w:frame="1"/>
+        </w:rPr>
+      </w:pPr>
+    </w:p>
+    <w:p>
+      <w:pPr>
+        <w:pStyle w:val="NormalWeb"/>
+        <w:rPr>
+          <w:b/>
+          <w:bCs/>
+          <w:color w:val="313131"/>
+          <w:sz w:val="22"/>
+          <w:bdr w:val="none" w:sz="0" w:space="0" w:color="auto" w:frame="1"/>
+        </w:rPr>
+      </w:pPr>
+      <w:r>
+        <w:rPr>
+          <w:b/>
+          <w:bCs/>
+          <w:color w:val="313131"/>
+          <w:sz w:val="22"/>
+          <w:bdr w:val="none" w:sz="0" w:space="0" w:color="auto" w:frame="1"/>
+        </w:rPr>
+        <w:t>Review:</w:t>
+      </w:r>
+    </w:p>
+    <w:p>
+      <w:pPr>
+        <w:pStyle w:val="NormalWeb"/>
+        <w:rPr>
+          <w:color w:val="313131"/>
+          <w:sz w:val="22"/>
+        </w:rPr>
+      </w:pPr>
+      <w:r>
+        <w:rPr>
+          <w:color w:val="313131"/>
+          <w:sz w:val="22"/>
+        </w:rPr>
+        <w:t>The PIC probe station experimental setup was com</w:t>
+      </w:r>
+      <w:r>
+        <w:rPr>
+          <w:color w:val="313131"/>
+          <w:sz w:val="22"/>
+        </w:rPr>
+        <w:t>pleted early in march</w:t>
+      </w:r>
+    </w:p>
+    <w:p>
+      <w:pPr>
+        <w:pStyle w:val="NormalWeb"/>
         <w:ind w:left="360"/>
         <w:rPr>
           <w:color w:val="313131"/>
@@ -354,43 +389,7 @@
           <w:sz w:val="22"/>
           <w:bdr w:val="none" w:sz="0" w:space="0" w:color="auto" w:frame="1"/>
         </w:rPr>
-        <w:t xml:space="preserve">Literature review – focus on </w:t>
-      </w:r>
-      <w:proofErr w:type="spellStart"/>
-      <w:r>
-        <w:rPr>
-          <w:color w:val="313131"/>
-          <w:sz w:val="22"/>
-          <w:bdr w:val="none" w:sz="0" w:space="0" w:color="auto" w:frame="1"/>
-        </w:rPr>
-        <w:t>Sagnac</w:t>
-      </w:r>
-      <w:proofErr w:type="spellEnd"/>
-      <w:r>
-        <w:rPr>
-          <w:color w:val="313131"/>
-          <w:sz w:val="22"/>
-          <w:bdr w:val="none" w:sz="0" w:space="0" w:color="auto" w:frame="1"/>
-        </w:rPr>
-        <w:t xml:space="preserve"> effect, and </w:t>
-      </w:r>
-      <w:proofErr w:type="spellStart"/>
-      <w:r>
-        <w:rPr>
-          <w:color w:val="313131"/>
-          <w:sz w:val="22"/>
-          <w:bdr w:val="none" w:sz="0" w:space="0" w:color="auto" w:frame="1"/>
-        </w:rPr>
-        <w:t>Sagnac</w:t>
-      </w:r>
-      <w:proofErr w:type="spellEnd"/>
-      <w:r>
-        <w:rPr>
-          <w:color w:val="313131"/>
-          <w:sz w:val="22"/>
-          <w:bdr w:val="none" w:sz="0" w:space="0" w:color="auto" w:frame="1"/>
-        </w:rPr>
-        <w:t xml:space="preserve"> based EPSs</w:t>
+        <w:t>Literature review – focus on Sagnac effect, and Sagnac based EPSs</w:t>
       </w:r>
     </w:p>
     <w:p>
@@ -565,7 +564,6 @@
         </w:rPr>
         <w:t xml:space="preserve"> (</w:t>
       </w:r>
-      <w:proofErr w:type="gramStart"/>
       <w:r>
         <w:rPr>
           <w:bCs/>
@@ -573,9 +571,8 @@
           <w:iCs/>
           <w:sz w:val="20"/>
         </w:rPr>
-        <w:t>depending</w:t>
-      </w:r>
-      <w:proofErr w:type="gramEnd"/>
+        <w:t>depending on</w:t>
+      </w:r>
       <w:r>
         <w:rPr>
           <w:bCs/>
@@ -603,6 +600,7 @@
           <w:bCs/>
           <w:sz w:val="20"/>
         </w:rPr>
+        <w:lastRenderedPageBreak/>
         <w:t>Optical coupling to PIC waveguides</w:t>
       </w:r>
     </w:p>
@@ -618,15 +616,20 @@
           <w:sz w:val="20"/>
         </w:rPr>
       </w:pPr>
-      <w:proofErr w:type="spellStart"/>
-      <w:r>
-        <w:rPr>
-          <w:bCs/>
-          <w:sz w:val="20"/>
-        </w:rPr>
-        <w:t>Characterizatino</w:t>
-      </w:r>
-      <w:proofErr w:type="spellEnd"/>
+      <w:r>
+        <w:rPr>
+          <w:bCs/>
+          <w:sz w:val="20"/>
+        </w:rPr>
+        <w:t>Characterizatio</w:t>
+      </w:r>
+      <w:r>
+        <w:rPr>
+          <w:bCs/>
+          <w:sz w:val="20"/>
+        </w:rPr>
+        <w:t>n</w:t>
+      </w:r>
       <w:r>
         <w:rPr>
           <w:bCs/>
@@ -714,7 +717,6 @@
           <w:bCs/>
           <w:sz w:val="20"/>
         </w:rPr>
-        <w:lastRenderedPageBreak/>
         <w:t>First measurement of entanglement visibility</w:t>
       </w:r>
     </w:p>

</xml_diff>